<commit_message>
Proyecto Intermodular: Practica 1 - Analisis de Mercado
</commit_message>
<xml_diff>
--- a/Proyecto Intermodular/Práctica 1 - Análisis de Mercado.docx
+++ b/Proyecto Intermodular/Práctica 1 - Análisis de Mercado.docx
@@ -762,11 +762,424 @@
           <w:highlight w:val="none"/>
           <w:lang w:val="es-ES"/>
         </w:rPr>
+        <w:t xml:space="preserve">Crear, modificar, cambiar de estado y eliminar las tareas, eventos, proyectos, entradas de diario, notas y registros as</w:t>
       </w:r>
       <w:r>
         <w:rPr>
           <w:highlight w:val="none"/>
           <w:lang w:val="es-ES"/>
+        </w:rPr>
+        <w:t xml:space="preserve">í como la posibilidad de purgar los completados</w:t>
+      </w:r>
+      <w:r>
+        <w:rPr>
+          <w:highlight w:val="none"/>
+          <w:lang w:val="es-ES"/>
+        </w:rPr>
+        <w:t xml:space="preserve">.</w:t>
+      </w:r>
+      <w:r>
+        <w:rPr>
+          <w:highlight w:val="none"/>
+          <w:lang w:val="es-ES"/>
+        </w:rPr>
+      </w:r>
+    </w:p>
+    <w:p>
+      <w:pPr>
+        <w:pBdr/>
+        <w:spacing/>
+        <w:ind w:firstLine="708"/>
+        <w:rPr>
+          <w:highlight w:val="none"/>
+          <w:lang w:val="es-ES" w:bidi="es-ES"/>
+        </w:rPr>
+      </w:pPr>
+      <w:r>
+        <w:rPr>
+          <w:highlight w:val="none"/>
+          <w:lang w:val="es-ES" w:bidi="es-ES"/>
+        </w:rPr>
+        <w:t xml:space="preserve">Poder buscar entre todos estos registros ya sea por fecha o por texto</w:t>
+      </w:r>
+      <w:r>
+        <w:rPr>
+          <w:highlight w:val="none"/>
+          <w:lang w:val="es-ES"/>
+        </w:rPr>
+      </w:r>
+    </w:p>
+    <w:p>
+      <w:pPr>
+        <w:pBdr/>
+        <w:spacing/>
+        <w:ind w:firstLine="708"/>
+        <w:rPr>
+          <w:highlight w:val="none"/>
+          <w:lang w:val="es-ES" w:bidi="es-ES"/>
+        </w:rPr>
+      </w:pPr>
+      <w:r>
+        <w:rPr>
+          <w:highlight w:val="none"/>
+          <w:lang w:val="es-ES" w:bidi="es-ES"/>
+        </w:rPr>
+        <w:t xml:space="preserve">Aplicar temas propios y customizar la paleta de colores de la aplicaci</w:t>
+      </w:r>
+      <w:r>
+        <w:rPr>
+          <w:highlight w:val="none"/>
+          <w:lang w:val="es-ES" w:bidi="es-ES"/>
+        </w:rPr>
+        <w:t xml:space="preserve">ón.</w:t>
+      </w:r>
+      <w:r>
+        <w:rPr>
+          <w:highlight w:val="none"/>
+          <w:lang w:val="es-ES"/>
+        </w:rPr>
+      </w:r>
+    </w:p>
+    <w:p>
+      <w:pPr>
+        <w:pBdr/>
+        <w:spacing/>
+        <w:ind w:firstLine="708"/>
+        <w:rPr>
+          <w:highlight w:val="none"/>
+          <w:lang w:val="es-ES" w:bidi="es-ES"/>
+        </w:rPr>
+      </w:pPr>
+      <w:r>
+        <w:rPr>
+          <w:highlight w:val="none"/>
+          <w:lang w:val="es-ES" w:bidi="es-ES"/>
+        </w:rPr>
+        <w:t xml:space="preserve">Navegar entre los distintos men</w:t>
+      </w:r>
+      <w:r>
+        <w:rPr>
+          <w:highlight w:val="none"/>
+          <w:lang w:val="es-ES" w:bidi="es-ES"/>
+        </w:rPr>
+        <w:t xml:space="preserve">us de diario, calendario, proyectos o tareas.</w:t>
+      </w:r>
+      <w:r>
+        <w:rPr>
+          <w:highlight w:val="none"/>
+          <w:lang w:val="es-ES"/>
+        </w:rPr>
+      </w:r>
+    </w:p>
+    <w:p>
+      <w:pPr>
+        <w:pBdr/>
+        <w:spacing/>
+        <w:ind/>
+        <w:rPr>
+          <w:highlight w:val="none"/>
+          <w:lang w:val="es-ES" w:bidi="es-ES"/>
+        </w:rPr>
+      </w:pPr>
+      <w:r>
+        <w:rPr>
+          <w:highlight w:val="none"/>
+          <w:lang w:val="es-ES" w:bidi="es-ES"/>
+        </w:rPr>
+      </w:r>
+      <w:r>
+        <w:rPr>
+          <w:highlight w:val="none"/>
+          <w:lang w:val="es-ES" w:bidi="es-ES"/>
+        </w:rPr>
+        <w:tab/>
+        <w:t xml:space="preserve">Navegar por un calendario as</w:t>
+      </w:r>
+      <w:r>
+        <w:rPr>
+          <w:highlight w:val="none"/>
+          <w:lang w:val="es-ES" w:bidi="es-ES"/>
+        </w:rPr>
+        <w:t xml:space="preserve">í como por el diario por fechas.</w:t>
+      </w:r>
+      <w:r>
+        <w:rPr>
+          <w:highlight w:val="none"/>
+          <w:lang w:val="es-ES"/>
+        </w:rPr>
+      </w:r>
+    </w:p>
+    <w:p>
+      <w:pPr>
+        <w:pBdr/>
+        <w:spacing/>
+        <w:ind/>
+        <w:rPr>
+          <w:highlight w:val="none"/>
+          <w:lang w:val="es-ES" w:bidi="es-ES"/>
+        </w:rPr>
+      </w:pPr>
+      <w:r>
+        <w:rPr>
+          <w:highlight w:val="none"/>
+          <w:lang w:val="es-ES" w:bidi="es-ES"/>
+        </w:rPr>
+        <w:tab/>
+        <w:t xml:space="preserve">El calendario debe tener vista Mensual, Semanal y Diara</w:t>
+      </w:r>
+      <w:r>
+        <w:rPr>
+          <w:highlight w:val="none"/>
+          <w:lang w:val="es-ES" w:bidi="es-ES"/>
+        </w:rPr>
+      </w:r>
+      <w:r>
+        <w:rPr>
+          <w:highlight w:val="none"/>
+          <w:lang w:val="es-ES" w:bidi="es-ES"/>
+        </w:rPr>
+        <w:t xml:space="preserve">.</w:t>
+      </w:r>
+      <w:r>
+        <w:rPr>
+          <w:highlight w:val="none"/>
+          <w:lang w:val="es-ES" w:bidi="es-ES"/>
+        </w:rPr>
+      </w:r>
+      <w:r>
+        <w:rPr>
+          <w:highlight w:val="none"/>
+          <w:lang w:val="es-ES" w:bidi="es-ES"/>
+        </w:rPr>
+      </w:r>
+      <w:r>
+        <w:rPr>
+          <w:highlight w:val="none"/>
+          <w:lang w:val="es-ES" w:bidi="es-ES"/>
+        </w:rPr>
+      </w:r>
+      <w:r>
+        <w:rPr>
+          <w:highlight w:val="none"/>
+          <w:lang w:val="es-ES" w:bidi="es-ES"/>
+        </w:rPr>
+      </w:r>
+    </w:p>
+    <w:p>
+      <w:pPr>
+        <w:pBdr/>
+        <w:spacing/>
+        <w:ind/>
+        <w:rPr>
+          <w:highlight w:val="none"/>
+          <w:lang w:val="es-ES" w:bidi="es-ES"/>
+        </w:rPr>
+      </w:pPr>
+      <w:r>
+        <w:rPr>
+          <w:highlight w:val="none"/>
+          <w:lang w:val="es-ES" w:bidi="es-ES"/>
+        </w:rPr>
+        <w:tab/>
+        <w:t xml:space="preserve">Reflejar el progreso de proyectos o tareas en el diario, as</w:t>
+      </w:r>
+      <w:r>
+        <w:rPr>
+          <w:highlight w:val="none"/>
+          <w:lang w:val="es-ES" w:bidi="es-ES"/>
+        </w:rPr>
+        <w:t xml:space="preserve">í como la capacidad de enlazarlas a este mismo</w:t>
+      </w:r>
+      <w:r>
+        <w:rPr>
+          <w:highlight w:val="none"/>
+          <w:lang w:val="es-ES" w:bidi="es-ES"/>
+        </w:rPr>
+        <w:t xml:space="preserve">.</w:t>
+      </w:r>
+      <w:r>
+        <w:rPr>
+          <w:highlight w:val="none"/>
+          <w:lang w:val="es-ES" w:bidi="es-ES"/>
+        </w:rPr>
+      </w:r>
+    </w:p>
+    <w:p>
+      <w:pPr>
+        <w:pBdr/>
+        <w:spacing/>
+        <w:ind/>
+        <w:rPr>
+          <w:highlight w:val="none"/>
+          <w:lang w:val="es-ES" w:bidi="es-ES"/>
+        </w:rPr>
+      </w:pPr>
+      <w:r>
+        <w:rPr>
+          <w:highlight w:val="none"/>
+          <w:lang w:val="es-ES" w:bidi="es-ES"/>
+        </w:rPr>
+        <w:tab/>
+        <w:t xml:space="preserve">Los proyectos deben estar formados por tareas.</w:t>
+      </w:r>
+      <w:r>
+        <w:rPr>
+          <w:highlight w:val="none"/>
+          <w:lang w:val="es-ES" w:bidi="es-ES"/>
+        </w:rPr>
+      </w:r>
+    </w:p>
+    <w:p>
+      <w:pPr>
+        <w:pBdr/>
+        <w:spacing/>
+        <w:ind/>
+        <w:rPr>
+          <w:highlight w:val="none"/>
+          <w:lang w:val="es-ES" w:bidi="es-ES"/>
+        </w:rPr>
+      </w:pPr>
+      <w:r>
+        <w:rPr>
+          <w:highlight w:val="none"/>
+          <w:lang w:val="es-ES" w:bidi="es-ES"/>
+        </w:rPr>
+        <w:tab/>
+        <w:t xml:space="preserve">Las tareas pueden tener subtareas, al completar todas las subtareas de una tarea, esta se autocompleta.</w:t>
+      </w:r>
+      <w:r>
+        <w:rPr>
+          <w:highlight w:val="none"/>
+          <w:lang w:val="es-ES" w:bidi="es-ES"/>
+        </w:rPr>
+      </w:r>
+    </w:p>
+    <w:p>
+      <w:pPr>
+        <w:pBdr/>
+        <w:spacing/>
+        <w:ind/>
+        <w:rPr>
+          <w:highlight w:val="none"/>
+          <w:lang w:val="es-ES" w:bidi="es-ES"/>
+        </w:rPr>
+      </w:pPr>
+      <w:r>
+        <w:rPr>
+          <w:highlight w:val="none"/>
+          <w:lang w:val="es-ES" w:bidi="es-ES"/>
+        </w:rPr>
+        <w:tab/>
+        <w:t xml:space="preserve">Tanto las tareas con subtareas como los proyectos deben tener una barra de progreso y un registro de las entradas de diario que lo referencian.</w:t>
+      </w:r>
+      <w:r>
+        <w:rPr>
+          <w:highlight w:val="none"/>
+          <w:lang w:val="es-ES" w:bidi="es-ES"/>
+        </w:rPr>
+      </w:r>
+    </w:p>
+    <w:p>
+      <w:pPr>
+        <w:pBdr/>
+        <w:spacing/>
+        <w:ind/>
+        <w:rPr>
+          <w:highlight w:val="none"/>
+          <w:lang w:val="es-ES" w:bidi="es-ES"/>
+        </w:rPr>
+      </w:pPr>
+      <w:r>
+        <w:rPr>
+          <w:highlight w:val="none"/>
+          <w:lang w:val="es-ES" w:bidi="es-ES"/>
+        </w:rPr>
+        <w:tab/>
+        <w:t xml:space="preserve">Un proyecto puede tener un enlace a github </w:t>
+      </w:r>
+      <w:r>
+        <w:rPr>
+          <w:i/>
+          <w:iCs/>
+          <w:highlight w:val="none"/>
+          <w:lang w:val="es-ES" w:bidi="es-ES"/>
+        </w:rPr>
+        <w:t xml:space="preserve">[tal vez incluir la capacidad de mostrar commits]</w:t>
+      </w:r>
+      <w:r>
+        <w:rPr>
+          <w:i/>
+          <w:iCs/>
+          <w:highlight w:val="none"/>
+          <w:lang w:val="es-ES" w:bidi="es-ES"/>
+        </w:rPr>
+      </w:r>
+      <w:r>
+        <w:rPr>
+          <w:highlight w:val="none"/>
+          <w:lang w:val="es-ES" w:bidi="es-ES"/>
+        </w:rPr>
+      </w:r>
+    </w:p>
+    <w:p>
+      <w:pPr>
+        <w:pBdr/>
+        <w:spacing/>
+        <w:ind/>
+        <w:jc w:val="left"/>
+        <w:rPr>
+          <w:highlight w:val="none"/>
+          <w:lang w:val="es-ES" w:bidi="es-ES"/>
+        </w:rPr>
+      </w:pPr>
+      <w:r>
+        <w:rPr>
+          <w:highlight w:val="none"/>
+          <w:lang w:val="es-ES" w:bidi="es-ES"/>
+        </w:rPr>
+        <w:tab/>
+        <w:t xml:space="preserve">Enviar avisos al sistema cuando se acerque el deadline de una tarea o cuando se haya programado un evento.</w:t>
+        <w:br/>
+      </w:r>
+      <w:r>
+        <w:rPr>
+          <w:highlight w:val="none"/>
+          <w:lang w:val="es-ES" w:bidi="es-ES"/>
+        </w:rPr>
+      </w:r>
+      <w:r>
+        <w:rPr>
+          <w:highlight w:val="none"/>
+          <w:lang w:val="es-ES" w:bidi="es-ES"/>
+        </w:rPr>
+      </w:r>
+    </w:p>
+    <w:p>
+      <w:pPr>
+        <w:pBdr/>
+        <w:spacing/>
+        <w:ind/>
+        <w:rPr>
+          <w:highlight w:val="none"/>
+          <w:lang w:val="es-ES" w:bidi="es-ES"/>
+        </w:rPr>
+      </w:pPr>
+      <w:r>
+        <w:rPr>
+          <w:highlight w:val="none"/>
+          <w:lang w:val="es-ES" w:bidi="es-ES"/>
+        </w:rPr>
+      </w:r>
+      <w:r>
+        <w:rPr>
+          <w:highlight w:val="none"/>
+          <w:lang w:val="es-ES" w:bidi="es-ES"/>
+        </w:rPr>
+      </w:r>
+      <w:r>
+        <w:rPr>
+          <w:highlight w:val="none"/>
+          <w:lang w:val="es-ES" w:bidi="es-ES"/>
         </w:rPr>
       </w:r>
     </w:p>
@@ -859,6 +1272,12 @@
           <w:lang w:val="es-ES"/>
         </w:rPr>
       </w:r>
+      <w:r>
+        <w:rPr>
+          <w:highlight w:val="none"/>
+          <w:lang w:val="es-ES"/>
+        </w:rPr>
+      </w:r>
     </w:p>
     <w:p>
       <w:pPr>
@@ -980,27 +1399,14 @@
           <w:highlight w:val="none"/>
           <w:lang w:val="es-ES"/>
         </w:rPr>
-        <w:t xml:space="preserve"> UI f</w:t>
+        <w:t xml:space="preserve"> Modularizar la app de forma correcta y hacer un buen sistema de logs para aislar los posibles fallos lo maximo posible y facilitar su correcci</w:t>
       </w:r>
       <w:r>
         <w:rPr>
           <w:highlight w:val="none"/>
           <w:lang w:val="es-ES"/>
         </w:rPr>
-        <w:t xml:space="preserve">á</w:t>
-      </w:r>
-      <w:r>
-        <w:rPr>
-          <w:highlight w:val="none"/>
-          <w:lang w:val="es-ES"/>
-        </w:rPr>
-        <w:t xml:space="preserve">cil de entender para evitar tutoriales o explicaciones.</w:t>
-      </w:r>
-      <w:r>
-        <w:rPr>
-          <w:highlight w:val="none"/>
-          <w:lang w:val="es-ES"/>
-        </w:rPr>
+        <w:t xml:space="preserve">ón.</w:t>
       </w:r>
       <w:r>
         <w:rPr>

</xml_diff>